<commit_message>
Fix pandas FutureWarning in data_loader; update project doc
</commit_message>
<xml_diff>
--- a/docs/Project.docx
+++ b/docs/Project.docx
@@ -90,25 +90,261 @@
           <w:sz w:val="20"/>
           <w:szCs w:val="20"/>
         </w:rPr>
-        <w:t>─</w:t>
-      </w:r>
-      <w:proofErr w:type="gramStart"/>
+        <w:t>──</w:t>
+      </w:r>
+      <w:r>
+        <w:rPr>
+          <w:sz w:val="20"/>
+          <w:szCs w:val="20"/>
+        </w:rPr>
+        <w:t xml:space="preserve"> .</w:t>
+      </w:r>
+      <w:proofErr w:type="spellStart"/>
+      <w:r>
+        <w:rPr>
+          <w:sz w:val="20"/>
+          <w:szCs w:val="20"/>
+        </w:rPr>
+        <w:t>github</w:t>
+      </w:r>
+      <w:proofErr w:type="spellEnd"/>
+      <w:r>
+        <w:rPr>
+          <w:sz w:val="20"/>
+          <w:szCs w:val="20"/>
+        </w:rPr>
+        <w:t>/</w:t>
+      </w:r>
+    </w:p>
+    <w:p>
+      <w:pPr>
+        <w:rPr>
+          <w:sz w:val="20"/>
+          <w:szCs w:val="20"/>
+        </w:rPr>
+      </w:pPr>
+      <w:r>
+        <w:rPr>
+          <w:sz w:val="20"/>
+          <w:szCs w:val="20"/>
+        </w:rPr>
+        <w:t>│   └── workflows/</w:t>
+      </w:r>
+    </w:p>
+    <w:p>
+      <w:pPr>
+        <w:rPr>
+          <w:sz w:val="20"/>
+          <w:szCs w:val="20"/>
+        </w:rPr>
+      </w:pPr>
+      <w:r>
+        <w:rPr>
+          <w:sz w:val="20"/>
+          <w:szCs w:val="20"/>
+        </w:rPr>
+        <w:t>│       └── fairness-</w:t>
+      </w:r>
+      <w:proofErr w:type="spellStart"/>
+      <w:r>
+        <w:rPr>
+          <w:sz w:val="20"/>
+          <w:szCs w:val="20"/>
+        </w:rPr>
+        <w:t>gate.yml</w:t>
+      </w:r>
+      <w:proofErr w:type="spellEnd"/>
+      <w:r>
+        <w:rPr>
+          <w:sz w:val="20"/>
+          <w:szCs w:val="20"/>
+        </w:rPr>
+        <w:t xml:space="preserve">          # CI: runs on every push, blocks merge if DI &lt; threshold</w:t>
+      </w:r>
+    </w:p>
+    <w:p>
+      <w:pPr>
+        <w:rPr>
+          <w:sz w:val="20"/>
+          <w:szCs w:val="20"/>
+        </w:rPr>
+      </w:pPr>
+      <w:r>
+        <w:rPr>
+          <w:sz w:val="20"/>
+          <w:szCs w:val="20"/>
+        </w:rPr>
+        <w:t>│</w:t>
+      </w:r>
+    </w:p>
+    <w:p>
+      <w:pPr>
+        <w:rPr>
+          <w:sz w:val="20"/>
+          <w:szCs w:val="20"/>
+        </w:rPr>
+      </w:pPr>
+      <w:r>
+        <w:rPr>
+          <w:rFonts w:ascii="MS Gothic" w:eastAsia="MS Gothic" w:hAnsi="MS Gothic" w:cs="MS Gothic" w:hint="eastAsia"/>
+          <w:sz w:val="20"/>
+          <w:szCs w:val="20"/>
+        </w:rPr>
+        <w:t>├</w:t>
+      </w:r>
       <w:r>
         <w:rPr>
           <w:rFonts w:ascii="Aptos" w:hAnsi="Aptos" w:cs="Aptos"/>
           <w:sz w:val="20"/>
           <w:szCs w:val="20"/>
         </w:rPr>
-        <w:t>─</w:t>
-      </w:r>
-      <w:r>
-        <w:rPr>
-          <w:sz w:val="20"/>
-          <w:szCs w:val="20"/>
-        </w:rPr>
-        <w:t xml:space="preserve"> .github</w:t>
-      </w:r>
-      <w:proofErr w:type="gramEnd"/>
+        <w:t>──</w:t>
+      </w:r>
+      <w:r>
+        <w:rPr>
+          <w:sz w:val="20"/>
+          <w:szCs w:val="20"/>
+        </w:rPr>
+        <w:t xml:space="preserve"> data/</w:t>
+      </w:r>
+    </w:p>
+    <w:p>
+      <w:pPr>
+        <w:rPr>
+          <w:sz w:val="20"/>
+          <w:szCs w:val="20"/>
+        </w:rPr>
+      </w:pPr>
+      <w:r>
+        <w:rPr>
+          <w:sz w:val="20"/>
+          <w:szCs w:val="20"/>
+        </w:rPr>
+        <w:t xml:space="preserve">│   </w:t>
+      </w:r>
+      <w:r>
+        <w:rPr>
+          <w:rFonts w:ascii="MS Gothic" w:eastAsia="MS Gothic" w:hAnsi="MS Gothic" w:cs="MS Gothic" w:hint="eastAsia"/>
+          <w:sz w:val="20"/>
+          <w:szCs w:val="20"/>
+        </w:rPr>
+        <w:t>├</w:t>
+      </w:r>
+      <w:r>
+        <w:rPr>
+          <w:rFonts w:ascii="Aptos" w:hAnsi="Aptos" w:cs="Aptos"/>
+          <w:sz w:val="20"/>
+          <w:szCs w:val="20"/>
+        </w:rPr>
+        <w:t>──</w:t>
+      </w:r>
+      <w:r>
+        <w:rPr>
+          <w:sz w:val="20"/>
+          <w:szCs w:val="20"/>
+        </w:rPr>
+        <w:t xml:space="preserve"> raw/</w:t>
+      </w:r>
+    </w:p>
+    <w:p>
+      <w:pPr>
+        <w:rPr>
+          <w:sz w:val="20"/>
+          <w:szCs w:val="20"/>
+        </w:rPr>
+      </w:pPr>
+      <w:r>
+        <w:rPr>
+          <w:sz w:val="20"/>
+          <w:szCs w:val="20"/>
+        </w:rPr>
+        <w:t>│   │   └── loan_data.csv              # real dataset (e.g. Kaggle Loan Prediction / Home Credit)</w:t>
+      </w:r>
+    </w:p>
+    <w:p>
+      <w:pPr>
+        <w:rPr>
+          <w:sz w:val="20"/>
+          <w:szCs w:val="20"/>
+        </w:rPr>
+      </w:pPr>
+      <w:r>
+        <w:rPr>
+          <w:sz w:val="20"/>
+          <w:szCs w:val="20"/>
+        </w:rPr>
+        <w:t>│   └── processed/</w:t>
+      </w:r>
+    </w:p>
+    <w:p>
+      <w:pPr>
+        <w:rPr>
+          <w:sz w:val="20"/>
+          <w:szCs w:val="20"/>
+        </w:rPr>
+      </w:pPr>
+      <w:r>
+        <w:rPr>
+          <w:sz w:val="20"/>
+          <w:szCs w:val="20"/>
+        </w:rPr>
+        <w:t>│       └── loan_data_clean.csv        # cleaned/encoded version used for training</w:t>
+      </w:r>
+    </w:p>
+    <w:p>
+      <w:pPr>
+        <w:rPr>
+          <w:sz w:val="20"/>
+          <w:szCs w:val="20"/>
+        </w:rPr>
+      </w:pPr>
+      <w:r>
+        <w:rPr>
+          <w:sz w:val="20"/>
+          <w:szCs w:val="20"/>
+        </w:rPr>
+        <w:t>│</w:t>
+      </w:r>
+    </w:p>
+    <w:p>
+      <w:pPr>
+        <w:rPr>
+          <w:sz w:val="20"/>
+          <w:szCs w:val="20"/>
+        </w:rPr>
+      </w:pPr>
+      <w:r>
+        <w:rPr>
+          <w:rFonts w:ascii="MS Gothic" w:eastAsia="MS Gothic" w:hAnsi="MS Gothic" w:cs="MS Gothic" w:hint="eastAsia"/>
+          <w:sz w:val="20"/>
+          <w:szCs w:val="20"/>
+        </w:rPr>
+        <w:t>├</w:t>
+      </w:r>
+      <w:r>
+        <w:rPr>
+          <w:rFonts w:ascii="Aptos" w:hAnsi="Aptos" w:cs="Aptos"/>
+          <w:sz w:val="20"/>
+          <w:szCs w:val="20"/>
+        </w:rPr>
+        <w:t>──</w:t>
+      </w:r>
+      <w:r>
+        <w:rPr>
+          <w:sz w:val="20"/>
+          <w:szCs w:val="20"/>
+        </w:rPr>
+        <w:t xml:space="preserve"> </w:t>
+      </w:r>
+      <w:proofErr w:type="spellStart"/>
+      <w:r>
+        <w:rPr>
+          <w:sz w:val="20"/>
+          <w:szCs w:val="20"/>
+        </w:rPr>
+        <w:t>src</w:t>
+      </w:r>
+      <w:proofErr w:type="spellEnd"/>
       <w:r>
         <w:rPr>
           <w:sz w:val="20"/>
@@ -129,22 +365,213 @@
           <w:sz w:val="20"/>
           <w:szCs w:val="20"/>
         </w:rPr>
-        <w:t>│   └── workflows/</w:t>
-      </w:r>
-    </w:p>
-    <w:p>
-      <w:pPr>
-        <w:rPr>
-          <w:sz w:val="20"/>
-          <w:szCs w:val="20"/>
-        </w:rPr>
-      </w:pPr>
-      <w:r>
-        <w:rPr>
-          <w:sz w:val="20"/>
-          <w:szCs w:val="20"/>
-        </w:rPr>
-        <w:t>│       └── fairness-gate.yml          # CI: runs on every push, blocks merge if DI &lt; threshold</w:t>
+        <w:t xml:space="preserve">│   </w:t>
+      </w:r>
+      <w:r>
+        <w:rPr>
+          <w:rFonts w:ascii="MS Gothic" w:eastAsia="MS Gothic" w:hAnsi="MS Gothic" w:cs="MS Gothic" w:hint="eastAsia"/>
+          <w:sz w:val="20"/>
+          <w:szCs w:val="20"/>
+        </w:rPr>
+        <w:t>├</w:t>
+      </w:r>
+      <w:r>
+        <w:rPr>
+          <w:rFonts w:ascii="Aptos" w:hAnsi="Aptos" w:cs="Aptos"/>
+          <w:sz w:val="20"/>
+          <w:szCs w:val="20"/>
+        </w:rPr>
+        <w:t>──</w:t>
+      </w:r>
+      <w:r>
+        <w:rPr>
+          <w:sz w:val="20"/>
+          <w:szCs w:val="20"/>
+        </w:rPr>
+        <w:t xml:space="preserve"> __init__.py</w:t>
+      </w:r>
+    </w:p>
+    <w:p>
+      <w:pPr>
+        <w:rPr>
+          <w:sz w:val="20"/>
+          <w:szCs w:val="20"/>
+        </w:rPr>
+      </w:pPr>
+      <w:r>
+        <w:rPr>
+          <w:sz w:val="20"/>
+          <w:szCs w:val="20"/>
+        </w:rPr>
+        <w:t xml:space="preserve">│   </w:t>
+      </w:r>
+      <w:r>
+        <w:rPr>
+          <w:rFonts w:ascii="MS Gothic" w:eastAsia="MS Gothic" w:hAnsi="MS Gothic" w:cs="MS Gothic" w:hint="eastAsia"/>
+          <w:sz w:val="20"/>
+          <w:szCs w:val="20"/>
+        </w:rPr>
+        <w:t>├</w:t>
+      </w:r>
+      <w:r>
+        <w:rPr>
+          <w:rFonts w:ascii="Aptos" w:hAnsi="Aptos" w:cs="Aptos"/>
+          <w:sz w:val="20"/>
+          <w:szCs w:val="20"/>
+        </w:rPr>
+        <w:t>──</w:t>
+      </w:r>
+      <w:r>
+        <w:rPr>
+          <w:sz w:val="20"/>
+          <w:szCs w:val="20"/>
+        </w:rPr>
+        <w:t xml:space="preserve"> data_loader.py                 # loads + preprocesses the loan dataset</w:t>
+      </w:r>
+    </w:p>
+    <w:p>
+      <w:pPr>
+        <w:rPr>
+          <w:sz w:val="20"/>
+          <w:szCs w:val="20"/>
+        </w:rPr>
+      </w:pPr>
+      <w:r>
+        <w:rPr>
+          <w:sz w:val="20"/>
+          <w:szCs w:val="20"/>
+        </w:rPr>
+        <w:t xml:space="preserve">│   </w:t>
+      </w:r>
+      <w:r>
+        <w:rPr>
+          <w:rFonts w:ascii="MS Gothic" w:eastAsia="MS Gothic" w:hAnsi="MS Gothic" w:cs="MS Gothic" w:hint="eastAsia"/>
+          <w:sz w:val="20"/>
+          <w:szCs w:val="20"/>
+        </w:rPr>
+        <w:t>├</w:t>
+      </w:r>
+      <w:r>
+        <w:rPr>
+          <w:rFonts w:ascii="Aptos" w:hAnsi="Aptos" w:cs="Aptos"/>
+          <w:sz w:val="20"/>
+          <w:szCs w:val="20"/>
+        </w:rPr>
+        <w:t>──</w:t>
+      </w:r>
+      <w:r>
+        <w:rPr>
+          <w:sz w:val="20"/>
+          <w:szCs w:val="20"/>
+        </w:rPr>
+        <w:t xml:space="preserve"> train_model.py                 # trains and saves the baseline model (.</w:t>
+      </w:r>
+      <w:proofErr w:type="spellStart"/>
+      <w:r>
+        <w:rPr>
+          <w:sz w:val="20"/>
+          <w:szCs w:val="20"/>
+        </w:rPr>
+        <w:t>pkl</w:t>
+      </w:r>
+      <w:proofErr w:type="spellEnd"/>
+      <w:r>
+        <w:rPr>
+          <w:sz w:val="20"/>
+          <w:szCs w:val="20"/>
+        </w:rPr>
+        <w:t>)</w:t>
+      </w:r>
+    </w:p>
+    <w:p>
+      <w:pPr>
+        <w:rPr>
+          <w:sz w:val="20"/>
+          <w:szCs w:val="20"/>
+        </w:rPr>
+      </w:pPr>
+      <w:r>
+        <w:rPr>
+          <w:sz w:val="20"/>
+          <w:szCs w:val="20"/>
+        </w:rPr>
+        <w:t xml:space="preserve">│   </w:t>
+      </w:r>
+      <w:r>
+        <w:rPr>
+          <w:rFonts w:ascii="MS Gothic" w:eastAsia="MS Gothic" w:hAnsi="MS Gothic" w:cs="MS Gothic" w:hint="eastAsia"/>
+          <w:sz w:val="20"/>
+          <w:szCs w:val="20"/>
+        </w:rPr>
+        <w:t>├</w:t>
+      </w:r>
+      <w:r>
+        <w:rPr>
+          <w:rFonts w:ascii="Aptos" w:hAnsi="Aptos" w:cs="Aptos"/>
+          <w:sz w:val="20"/>
+          <w:szCs w:val="20"/>
+        </w:rPr>
+        <w:t>──</w:t>
+      </w:r>
+      <w:r>
+        <w:rPr>
+          <w:sz w:val="20"/>
+          <w:szCs w:val="20"/>
+        </w:rPr>
+        <w:t xml:space="preserve"> fairness_metrics.py            # disparate impact, equal opportunity, etc.</w:t>
+      </w:r>
+    </w:p>
+    <w:p>
+      <w:pPr>
+        <w:rPr>
+          <w:sz w:val="20"/>
+          <w:szCs w:val="20"/>
+        </w:rPr>
+      </w:pPr>
+      <w:r>
+        <w:rPr>
+          <w:sz w:val="20"/>
+          <w:szCs w:val="20"/>
+        </w:rPr>
+        <w:t xml:space="preserve">│   </w:t>
+      </w:r>
+      <w:r>
+        <w:rPr>
+          <w:rFonts w:ascii="MS Gothic" w:eastAsia="MS Gothic" w:hAnsi="MS Gothic" w:cs="MS Gothic" w:hint="eastAsia"/>
+          <w:sz w:val="20"/>
+          <w:szCs w:val="20"/>
+        </w:rPr>
+        <w:t>├</w:t>
+      </w:r>
+      <w:r>
+        <w:rPr>
+          <w:rFonts w:ascii="Aptos" w:hAnsi="Aptos" w:cs="Aptos"/>
+          <w:sz w:val="20"/>
+          <w:szCs w:val="20"/>
+        </w:rPr>
+        <w:t>──</w:t>
+      </w:r>
+      <w:r>
+        <w:rPr>
+          <w:sz w:val="20"/>
+          <w:szCs w:val="20"/>
+        </w:rPr>
+        <w:t xml:space="preserve"> explainability.py              # SHAP wrapper functions used by both app.py and CI</w:t>
+      </w:r>
+    </w:p>
+    <w:p>
+      <w:pPr>
+        <w:rPr>
+          <w:sz w:val="20"/>
+          <w:szCs w:val="20"/>
+        </w:rPr>
+      </w:pPr>
+      <w:r>
+        <w:rPr>
+          <w:sz w:val="20"/>
+          <w:szCs w:val="20"/>
+        </w:rPr>
+        <w:t>│   └── drift_detection.py             # CUSUM (and later SPRT-t/SBF if you add them)</w:t>
       </w:r>
     </w:p>
     <w:p>
@@ -190,7 +617,7 @@
           <w:sz w:val="20"/>
           <w:szCs w:val="20"/>
         </w:rPr>
-        <w:t xml:space="preserve"> data/</w:t>
+        <w:t xml:space="preserve"> scripts/</w:t>
       </w:r>
     </w:p>
     <w:p>
@@ -228,52 +655,38 @@
           <w:sz w:val="20"/>
           <w:szCs w:val="20"/>
         </w:rPr>
-        <w:t xml:space="preserve"> raw/</w:t>
-      </w:r>
-    </w:p>
-    <w:p>
-      <w:pPr>
-        <w:rPr>
-          <w:sz w:val="20"/>
-          <w:szCs w:val="20"/>
-        </w:rPr>
-      </w:pPr>
-      <w:r>
-        <w:rPr>
-          <w:sz w:val="20"/>
-          <w:szCs w:val="20"/>
-        </w:rPr>
-        <w:t>│   │   └── loan_data.csv              # real dataset (e.g. Kaggle Loan Prediction / Home Credit)</w:t>
-      </w:r>
-    </w:p>
-    <w:p>
-      <w:pPr>
-        <w:rPr>
-          <w:sz w:val="20"/>
-          <w:szCs w:val="20"/>
-        </w:rPr>
-      </w:pPr>
-      <w:r>
-        <w:rPr>
-          <w:sz w:val="20"/>
-          <w:szCs w:val="20"/>
-        </w:rPr>
-        <w:t>│   └── processed/</w:t>
-      </w:r>
-    </w:p>
-    <w:p>
-      <w:pPr>
-        <w:rPr>
-          <w:sz w:val="20"/>
-          <w:szCs w:val="20"/>
-        </w:rPr>
-      </w:pPr>
-      <w:r>
-        <w:rPr>
-          <w:sz w:val="20"/>
-          <w:szCs w:val="20"/>
-        </w:rPr>
-        <w:t>│       └── loan_data_clean.csv        # cleaned/encoded version used for training</w:t>
+        <w:t xml:space="preserve"> fairness_gate.py               # CI </w:t>
+      </w:r>
+      <w:proofErr w:type="spellStart"/>
+      <w:r>
+        <w:rPr>
+          <w:sz w:val="20"/>
+          <w:szCs w:val="20"/>
+        </w:rPr>
+        <w:t>entrypoint</w:t>
+      </w:r>
+      <w:proofErr w:type="spellEnd"/>
+      <w:r>
+        <w:rPr>
+          <w:sz w:val="20"/>
+          <w:szCs w:val="20"/>
+        </w:rPr>
+        <w:t>: trains/evaluates, fails build if unfair</w:t>
+      </w:r>
+    </w:p>
+    <w:p>
+      <w:pPr>
+        <w:rPr>
+          <w:sz w:val="20"/>
+          <w:szCs w:val="20"/>
+        </w:rPr>
+      </w:pPr>
+      <w:r>
+        <w:rPr>
+          <w:sz w:val="20"/>
+          <w:szCs w:val="20"/>
+        </w:rPr>
+        <w:t>│   └── cusum_drift_detection.py       # CI/standalone: simulates batches, detects drift, plots</w:t>
       </w:r>
     </w:p>
     <w:p>
@@ -319,356 +732,6 @@
           <w:sz w:val="20"/>
           <w:szCs w:val="20"/>
         </w:rPr>
-        <w:t xml:space="preserve"> src/</w:t>
-      </w:r>
-    </w:p>
-    <w:p>
-      <w:pPr>
-        <w:rPr>
-          <w:sz w:val="20"/>
-          <w:szCs w:val="20"/>
-        </w:rPr>
-      </w:pPr>
-      <w:r>
-        <w:rPr>
-          <w:sz w:val="20"/>
-          <w:szCs w:val="20"/>
-        </w:rPr>
-        <w:t xml:space="preserve">│   </w:t>
-      </w:r>
-      <w:r>
-        <w:rPr>
-          <w:rFonts w:ascii="MS Gothic" w:eastAsia="MS Gothic" w:hAnsi="MS Gothic" w:cs="MS Gothic" w:hint="eastAsia"/>
-          <w:sz w:val="20"/>
-          <w:szCs w:val="20"/>
-        </w:rPr>
-        <w:t>├</w:t>
-      </w:r>
-      <w:r>
-        <w:rPr>
-          <w:rFonts w:ascii="Aptos" w:hAnsi="Aptos" w:cs="Aptos"/>
-          <w:sz w:val="20"/>
-          <w:szCs w:val="20"/>
-        </w:rPr>
-        <w:t>──</w:t>
-      </w:r>
-      <w:r>
-        <w:rPr>
-          <w:sz w:val="20"/>
-          <w:szCs w:val="20"/>
-        </w:rPr>
-        <w:t xml:space="preserve"> __init__.py</w:t>
-      </w:r>
-    </w:p>
-    <w:p>
-      <w:pPr>
-        <w:rPr>
-          <w:sz w:val="20"/>
-          <w:szCs w:val="20"/>
-        </w:rPr>
-      </w:pPr>
-      <w:r>
-        <w:rPr>
-          <w:sz w:val="20"/>
-          <w:szCs w:val="20"/>
-        </w:rPr>
-        <w:t xml:space="preserve">│   </w:t>
-      </w:r>
-      <w:r>
-        <w:rPr>
-          <w:rFonts w:ascii="MS Gothic" w:eastAsia="MS Gothic" w:hAnsi="MS Gothic" w:cs="MS Gothic" w:hint="eastAsia"/>
-          <w:sz w:val="20"/>
-          <w:szCs w:val="20"/>
-        </w:rPr>
-        <w:t>├</w:t>
-      </w:r>
-      <w:r>
-        <w:rPr>
-          <w:rFonts w:ascii="Aptos" w:hAnsi="Aptos" w:cs="Aptos"/>
-          <w:sz w:val="20"/>
-          <w:szCs w:val="20"/>
-        </w:rPr>
-        <w:t>──</w:t>
-      </w:r>
-      <w:r>
-        <w:rPr>
-          <w:sz w:val="20"/>
-          <w:szCs w:val="20"/>
-        </w:rPr>
-        <w:t xml:space="preserve"> data_loader.py                 # loads + preprocesses the loan dataset</w:t>
-      </w:r>
-    </w:p>
-    <w:p>
-      <w:pPr>
-        <w:rPr>
-          <w:sz w:val="20"/>
-          <w:szCs w:val="20"/>
-        </w:rPr>
-      </w:pPr>
-      <w:r>
-        <w:rPr>
-          <w:sz w:val="20"/>
-          <w:szCs w:val="20"/>
-        </w:rPr>
-        <w:t xml:space="preserve">│   </w:t>
-      </w:r>
-      <w:r>
-        <w:rPr>
-          <w:rFonts w:ascii="MS Gothic" w:eastAsia="MS Gothic" w:hAnsi="MS Gothic" w:cs="MS Gothic" w:hint="eastAsia"/>
-          <w:sz w:val="20"/>
-          <w:szCs w:val="20"/>
-        </w:rPr>
-        <w:t>├</w:t>
-      </w:r>
-      <w:r>
-        <w:rPr>
-          <w:rFonts w:ascii="Aptos" w:hAnsi="Aptos" w:cs="Aptos"/>
-          <w:sz w:val="20"/>
-          <w:szCs w:val="20"/>
-        </w:rPr>
-        <w:t>──</w:t>
-      </w:r>
-      <w:r>
-        <w:rPr>
-          <w:sz w:val="20"/>
-          <w:szCs w:val="20"/>
-        </w:rPr>
-        <w:t xml:space="preserve"> train_model.py                 # trains and saves the baseline model (.pkl)</w:t>
-      </w:r>
-    </w:p>
-    <w:p>
-      <w:pPr>
-        <w:rPr>
-          <w:sz w:val="20"/>
-          <w:szCs w:val="20"/>
-        </w:rPr>
-      </w:pPr>
-      <w:r>
-        <w:rPr>
-          <w:sz w:val="20"/>
-          <w:szCs w:val="20"/>
-        </w:rPr>
-        <w:t xml:space="preserve">│   </w:t>
-      </w:r>
-      <w:r>
-        <w:rPr>
-          <w:rFonts w:ascii="MS Gothic" w:eastAsia="MS Gothic" w:hAnsi="MS Gothic" w:cs="MS Gothic" w:hint="eastAsia"/>
-          <w:sz w:val="20"/>
-          <w:szCs w:val="20"/>
-        </w:rPr>
-        <w:t>├</w:t>
-      </w:r>
-      <w:r>
-        <w:rPr>
-          <w:rFonts w:ascii="Aptos" w:hAnsi="Aptos" w:cs="Aptos"/>
-          <w:sz w:val="20"/>
-          <w:szCs w:val="20"/>
-        </w:rPr>
-        <w:t>──</w:t>
-      </w:r>
-      <w:r>
-        <w:rPr>
-          <w:sz w:val="20"/>
-          <w:szCs w:val="20"/>
-        </w:rPr>
-        <w:t xml:space="preserve"> fairness_metrics.py            # disparate impact, equal opportunity, etc.</w:t>
-      </w:r>
-    </w:p>
-    <w:p>
-      <w:pPr>
-        <w:rPr>
-          <w:sz w:val="20"/>
-          <w:szCs w:val="20"/>
-        </w:rPr>
-      </w:pPr>
-      <w:r>
-        <w:rPr>
-          <w:sz w:val="20"/>
-          <w:szCs w:val="20"/>
-        </w:rPr>
-        <w:t xml:space="preserve">│   </w:t>
-      </w:r>
-      <w:r>
-        <w:rPr>
-          <w:rFonts w:ascii="MS Gothic" w:eastAsia="MS Gothic" w:hAnsi="MS Gothic" w:cs="MS Gothic" w:hint="eastAsia"/>
-          <w:sz w:val="20"/>
-          <w:szCs w:val="20"/>
-        </w:rPr>
-        <w:t>├</w:t>
-      </w:r>
-      <w:r>
-        <w:rPr>
-          <w:rFonts w:ascii="Aptos" w:hAnsi="Aptos" w:cs="Aptos"/>
-          <w:sz w:val="20"/>
-          <w:szCs w:val="20"/>
-        </w:rPr>
-        <w:t>──</w:t>
-      </w:r>
-      <w:r>
-        <w:rPr>
-          <w:sz w:val="20"/>
-          <w:szCs w:val="20"/>
-        </w:rPr>
-        <w:t xml:space="preserve"> explainability.py              # SHAP wrapper functions used by both app.py and CI</w:t>
-      </w:r>
-    </w:p>
-    <w:p>
-      <w:pPr>
-        <w:rPr>
-          <w:sz w:val="20"/>
-          <w:szCs w:val="20"/>
-        </w:rPr>
-      </w:pPr>
-      <w:r>
-        <w:rPr>
-          <w:sz w:val="20"/>
-          <w:szCs w:val="20"/>
-        </w:rPr>
-        <w:t>│   └── drift_detection.py             # CUSUM (and later SPRT-t/SBF if you add them)</w:t>
-      </w:r>
-    </w:p>
-    <w:p>
-      <w:pPr>
-        <w:rPr>
-          <w:sz w:val="20"/>
-          <w:szCs w:val="20"/>
-        </w:rPr>
-      </w:pPr>
-      <w:r>
-        <w:rPr>
-          <w:sz w:val="20"/>
-          <w:szCs w:val="20"/>
-        </w:rPr>
-        <w:t>│</w:t>
-      </w:r>
-    </w:p>
-    <w:p>
-      <w:pPr>
-        <w:rPr>
-          <w:sz w:val="20"/>
-          <w:szCs w:val="20"/>
-        </w:rPr>
-      </w:pPr>
-      <w:r>
-        <w:rPr>
-          <w:rFonts w:ascii="MS Gothic" w:eastAsia="MS Gothic" w:hAnsi="MS Gothic" w:cs="MS Gothic" w:hint="eastAsia"/>
-          <w:sz w:val="20"/>
-          <w:szCs w:val="20"/>
-        </w:rPr>
-        <w:t>├</w:t>
-      </w:r>
-      <w:r>
-        <w:rPr>
-          <w:rFonts w:ascii="Aptos" w:hAnsi="Aptos" w:cs="Aptos"/>
-          <w:sz w:val="20"/>
-          <w:szCs w:val="20"/>
-        </w:rPr>
-        <w:t>──</w:t>
-      </w:r>
-      <w:r>
-        <w:rPr>
-          <w:sz w:val="20"/>
-          <w:szCs w:val="20"/>
-        </w:rPr>
-        <w:t xml:space="preserve"> scripts/</w:t>
-      </w:r>
-    </w:p>
-    <w:p>
-      <w:pPr>
-        <w:rPr>
-          <w:sz w:val="20"/>
-          <w:szCs w:val="20"/>
-        </w:rPr>
-      </w:pPr>
-      <w:r>
-        <w:rPr>
-          <w:sz w:val="20"/>
-          <w:szCs w:val="20"/>
-        </w:rPr>
-        <w:t xml:space="preserve">│   </w:t>
-      </w:r>
-      <w:r>
-        <w:rPr>
-          <w:rFonts w:ascii="MS Gothic" w:eastAsia="MS Gothic" w:hAnsi="MS Gothic" w:cs="MS Gothic" w:hint="eastAsia"/>
-          <w:sz w:val="20"/>
-          <w:szCs w:val="20"/>
-        </w:rPr>
-        <w:t>├</w:t>
-      </w:r>
-      <w:r>
-        <w:rPr>
-          <w:rFonts w:ascii="Aptos" w:hAnsi="Aptos" w:cs="Aptos"/>
-          <w:sz w:val="20"/>
-          <w:szCs w:val="20"/>
-        </w:rPr>
-        <w:t>──</w:t>
-      </w:r>
-      <w:r>
-        <w:rPr>
-          <w:sz w:val="20"/>
-          <w:szCs w:val="20"/>
-        </w:rPr>
-        <w:t xml:space="preserve"> fairness_gate.py               # CI entrypoint: trains/evaluates, fails build if unfair</w:t>
-      </w:r>
-    </w:p>
-    <w:p>
-      <w:pPr>
-        <w:rPr>
-          <w:sz w:val="20"/>
-          <w:szCs w:val="20"/>
-        </w:rPr>
-      </w:pPr>
-      <w:r>
-        <w:rPr>
-          <w:sz w:val="20"/>
-          <w:szCs w:val="20"/>
-        </w:rPr>
-        <w:t>│   └── cusum_drift_detection.py       # CI/standalone: simulates batches, detects drift, plots</w:t>
-      </w:r>
-    </w:p>
-    <w:p>
-      <w:pPr>
-        <w:rPr>
-          <w:sz w:val="20"/>
-          <w:szCs w:val="20"/>
-        </w:rPr>
-      </w:pPr>
-      <w:r>
-        <w:rPr>
-          <w:sz w:val="20"/>
-          <w:szCs w:val="20"/>
-        </w:rPr>
-        <w:t>│</w:t>
-      </w:r>
-    </w:p>
-    <w:p>
-      <w:pPr>
-        <w:rPr>
-          <w:sz w:val="20"/>
-          <w:szCs w:val="20"/>
-        </w:rPr>
-      </w:pPr>
-      <w:r>
-        <w:rPr>
-          <w:rFonts w:ascii="MS Gothic" w:eastAsia="MS Gothic" w:hAnsi="MS Gothic" w:cs="MS Gothic" w:hint="eastAsia"/>
-          <w:sz w:val="20"/>
-          <w:szCs w:val="20"/>
-        </w:rPr>
-        <w:t>├</w:t>
-      </w:r>
-      <w:r>
-        <w:rPr>
-          <w:rFonts w:ascii="Aptos" w:hAnsi="Aptos" w:cs="Aptos"/>
-          <w:sz w:val="20"/>
-          <w:szCs w:val="20"/>
-        </w:rPr>
-        <w:t>──</w:t>
-      </w:r>
-      <w:r>
-        <w:rPr>
-          <w:sz w:val="20"/>
-          <w:szCs w:val="20"/>
-        </w:rPr>
         <w:t xml:space="preserve"> models/</w:t>
       </w:r>
     </w:p>
@@ -684,7 +747,39 @@
           <w:sz w:val="20"/>
           <w:szCs w:val="20"/>
         </w:rPr>
-        <w:t>│   └── baseline_model.pkl             # versioned model artifact (or track via MLflow/DVC instead)</w:t>
+        <w:t xml:space="preserve">│   └── </w:t>
+      </w:r>
+      <w:proofErr w:type="spellStart"/>
+      <w:r>
+        <w:rPr>
+          <w:sz w:val="20"/>
+          <w:szCs w:val="20"/>
+        </w:rPr>
+        <w:t>baseline_model.pkl</w:t>
+      </w:r>
+      <w:proofErr w:type="spellEnd"/>
+      <w:r>
+        <w:rPr>
+          <w:sz w:val="20"/>
+          <w:szCs w:val="20"/>
+        </w:rPr>
+        <w:t xml:space="preserve">             # versioned model artifact (or track via </w:t>
+      </w:r>
+      <w:proofErr w:type="spellStart"/>
+      <w:r>
+        <w:rPr>
+          <w:sz w:val="20"/>
+          <w:szCs w:val="20"/>
+        </w:rPr>
+        <w:t>MLflow</w:t>
+      </w:r>
+      <w:proofErr w:type="spellEnd"/>
+      <w:r>
+        <w:rPr>
+          <w:sz w:val="20"/>
+          <w:szCs w:val="20"/>
+        </w:rPr>
+        <w:t>/DVC instead)</w:t>
       </w:r>
     </w:p>
     <w:p>
@@ -883,17 +978,17 @@
           <w:sz w:val="20"/>
           <w:szCs w:val="20"/>
         </w:rPr>
-        <w:t>│   └── eda_and_</w:t>
-      </w:r>
-      <w:proofErr w:type="gramStart"/>
-      <w:r>
-        <w:rPr>
-          <w:sz w:val="20"/>
-          <w:szCs w:val="20"/>
-        </w:rPr>
-        <w:t>experiments.ipynb</w:t>
-      </w:r>
-      <w:proofErr w:type="gramEnd"/>
+        <w:t xml:space="preserve">│   └── </w:t>
+      </w:r>
+      <w:proofErr w:type="spellStart"/>
+      <w:r>
+        <w:rPr>
+          <w:sz w:val="20"/>
+          <w:szCs w:val="20"/>
+        </w:rPr>
+        <w:t>eda_and_experiments.ipynb</w:t>
+      </w:r>
+      <w:proofErr w:type="spellEnd"/>
       <w:r>
         <w:rPr>
           <w:sz w:val="20"/>
@@ -945,7 +1040,23 @@
           <w:sz w:val="20"/>
           <w:szCs w:val="20"/>
         </w:rPr>
-        <w:t xml:space="preserve"> app.py                             # Streamlit UI (tabs: Audit / Drift / Explainability / History)</w:t>
+        <w:t xml:space="preserve"> app.py                             # </w:t>
+      </w:r>
+      <w:proofErr w:type="spellStart"/>
+      <w:r>
+        <w:rPr>
+          <w:sz w:val="20"/>
+          <w:szCs w:val="20"/>
+        </w:rPr>
+        <w:t>Streamlit</w:t>
+      </w:r>
+      <w:proofErr w:type="spellEnd"/>
+      <w:r>
+        <w:rPr>
+          <w:sz w:val="20"/>
+          <w:szCs w:val="20"/>
+        </w:rPr>
+        <w:t xml:space="preserve"> UI (tabs: Audit / Drift / Explainability / History)</w:t>
       </w:r>
     </w:p>
     <w:p>
@@ -1029,7 +1140,23 @@
           <w:sz w:val="20"/>
           <w:szCs w:val="20"/>
         </w:rPr>
-        <w:t xml:space="preserve"> architecture_diagram.png       # the layered MLOps diagram from your slides</w:t>
+        <w:t xml:space="preserve"> architecture_diagram.png       # the layered </w:t>
+      </w:r>
+      <w:proofErr w:type="spellStart"/>
+      <w:r>
+        <w:rPr>
+          <w:sz w:val="20"/>
+          <w:szCs w:val="20"/>
+        </w:rPr>
+        <w:t>MLOps</w:t>
+      </w:r>
+      <w:proofErr w:type="spellEnd"/>
+      <w:r>
+        <w:rPr>
+          <w:sz w:val="20"/>
+          <w:szCs w:val="20"/>
+        </w:rPr>
+        <w:t xml:space="preserve"> diagram from your slides</w:t>
       </w:r>
     </w:p>
     <w:p>
@@ -1059,7 +1186,23 @@
           <w:sz w:val="20"/>
           <w:szCs w:val="20"/>
         </w:rPr>
-        <w:t>│       └── capstone_paper.md          # or .docx/.tex — your research paper draft</w:t>
+        <w:t>│       └── capstone_paper.md          # or .docx/.</w:t>
+      </w:r>
+      <w:proofErr w:type="spellStart"/>
+      <w:r>
+        <w:rPr>
+          <w:sz w:val="20"/>
+          <w:szCs w:val="20"/>
+        </w:rPr>
+        <w:t>tex</w:t>
+      </w:r>
+      <w:proofErr w:type="spellEnd"/>
+      <w:r>
+        <w:rPr>
+          <w:sz w:val="20"/>
+          <w:szCs w:val="20"/>
+        </w:rPr>
+        <w:t xml:space="preserve"> — your research paper draft</w:t>
       </w:r>
     </w:p>
     <w:p>
@@ -1136,8 +1279,17 @@
           <w:sz w:val="20"/>
           <w:szCs w:val="20"/>
         </w:rPr>
-        <w:t xml:space="preserve"> Dockerfile</w:t>
-      </w:r>
+        <w:t xml:space="preserve"> </w:t>
+      </w:r>
+      <w:proofErr w:type="spellStart"/>
+      <w:r>
+        <w:rPr>
+          <w:sz w:val="20"/>
+          <w:szCs w:val="20"/>
+        </w:rPr>
+        <w:t>Dockerfile</w:t>
+      </w:r>
+      <w:proofErr w:type="spellEnd"/>
     </w:p>
     <w:p>
       <w:pPr>
@@ -1160,25 +1312,24 @@
           <w:sz w:val="20"/>
           <w:szCs w:val="20"/>
         </w:rPr>
-        <w:t>─</w:t>
-      </w:r>
-      <w:proofErr w:type="gramStart"/>
-      <w:r>
-        <w:rPr>
-          <w:rFonts w:ascii="Aptos" w:hAnsi="Aptos" w:cs="Aptos"/>
-          <w:sz w:val="20"/>
-          <w:szCs w:val="20"/>
-        </w:rPr>
-        <w:t>─</w:t>
-      </w:r>
-      <w:r>
-        <w:rPr>
-          <w:sz w:val="20"/>
-          <w:szCs w:val="20"/>
-        </w:rPr>
-        <w:t xml:space="preserve"> .gitignore</w:t>
-      </w:r>
-      <w:proofErr w:type="gramEnd"/>
+        <w:t>──</w:t>
+      </w:r>
+      <w:r>
+        <w:rPr>
+          <w:sz w:val="20"/>
+          <w:szCs w:val="20"/>
+        </w:rPr>
+        <w:t xml:space="preserve"> .</w:t>
+      </w:r>
+      <w:proofErr w:type="spellStart"/>
+      <w:r>
+        <w:rPr>
+          <w:sz w:val="20"/>
+          <w:szCs w:val="20"/>
+        </w:rPr>
+        <w:t>gitignore</w:t>
+      </w:r>
+      <w:proofErr w:type="spellEnd"/>
     </w:p>
     <w:p>
       <w:pPr>
@@ -1296,8 +1447,19 @@
           <w:sz w:val="20"/>
           <w:szCs w:val="20"/>
         </w:rPr>
-        <w:t>fairness-gate.yml</w:t>
-      </w:r>
+        <w:t>fairness-</w:t>
+      </w:r>
+      <w:proofErr w:type="spellStart"/>
+      <w:r>
+        <w:rPr>
+          <w:b/>
+          <w:bCs/>
+          <w:sz w:val="20"/>
+          <w:szCs w:val="20"/>
+        </w:rPr>
+        <w:t>gate.yml</w:t>
+      </w:r>
+      <w:proofErr w:type="spellEnd"/>
       <w:r>
         <w:rPr>
           <w:sz w:val="20"/>
@@ -1331,7 +1493,23 @@
           <w:sz w:val="20"/>
           <w:szCs w:val="20"/>
         </w:rPr>
-        <w:t xml:space="preserve"> — loads the real Loan Prediction dataset if present, otherwise uses a schema-matching synthetic fallback so you can build everything else right now. It cleans missing values and encodes categoricals exactly the way the real dataset needs. </w:t>
+        <w:t xml:space="preserve"> — loads the real Loan Prediction dataset if present, otherwise uses a schema-matching synthetic fallback so you can build everything else right now. It cleans missing values and encodes </w:t>
+      </w:r>
+      <w:proofErr w:type="spellStart"/>
+      <w:r>
+        <w:rPr>
+          <w:sz w:val="20"/>
+          <w:szCs w:val="20"/>
+        </w:rPr>
+        <w:t>categoricals</w:t>
+      </w:r>
+      <w:proofErr w:type="spellEnd"/>
+      <w:r>
+        <w:rPr>
+          <w:sz w:val="20"/>
+          <w:szCs w:val="20"/>
+        </w:rPr>
+        <w:t xml:space="preserve"> exactly the way the real dataset needs. </w:t>
       </w:r>
     </w:p>
     <w:p>
@@ -1387,7 +1565,23 @@
           <w:sz w:val="20"/>
           <w:szCs w:val="20"/>
         </w:rPr>
-        <w:t xml:space="preserve"> — trains a scaled Logistic Regression baseline, reports accuracy + DI, and saves a model bundle (model, scaler, feature names) to models/baseline_model.pkl. Current run: 82.7% test accuracy, DI = 0.943 (passes the 0.8 fairness threshold) on synthetic data.</w:t>
+        <w:t xml:space="preserve"> — trains a scaled Logistic Regression baseline, reports accuracy + DI, and saves a model bundle (model, scaler, feature names) to models/</w:t>
+      </w:r>
+      <w:proofErr w:type="spellStart"/>
+      <w:r>
+        <w:rPr>
+          <w:sz w:val="20"/>
+          <w:szCs w:val="20"/>
+        </w:rPr>
+        <w:t>baseline_model.pkl</w:t>
+      </w:r>
+      <w:proofErr w:type="spellEnd"/>
+      <w:r>
+        <w:rPr>
+          <w:sz w:val="20"/>
+          <w:szCs w:val="20"/>
+        </w:rPr>
+        <w:t>. Current run: 82.7% test accuracy, DI = 0.943 (passes the 0.8 fairness threshold) on synthetic data.</w:t>
       </w:r>
     </w:p>
     <w:p>
@@ -1416,7 +1610,55 @@
           <w:sz w:val="20"/>
           <w:szCs w:val="20"/>
         </w:rPr>
-        <w:t xml:space="preserve"> — SHAP wrapper. Tested output makes sense: Credit_History and ApplicantIncome are the top drivers of approval, which matches known behavior of this real dataset.</w:t>
+        <w:t xml:space="preserve"> — SHAP wrapper. Tested output makes sense: </w:t>
+      </w:r>
+      <w:proofErr w:type="spellStart"/>
+      <w:r>
+        <w:rPr>
+          <w:sz w:val="20"/>
+          <w:szCs w:val="20"/>
+        </w:rPr>
+        <w:t>Credit_History</w:t>
+      </w:r>
+      <w:proofErr w:type="spellEnd"/>
+      <w:r>
+        <w:rPr>
+          <w:sz w:val="20"/>
+          <w:szCs w:val="20"/>
+        </w:rPr>
+        <w:t xml:space="preserve"> and </w:t>
+      </w:r>
+      <w:proofErr w:type="spellStart"/>
+      <w:r>
+        <w:rPr>
+          <w:sz w:val="20"/>
+          <w:szCs w:val="20"/>
+        </w:rPr>
+        <w:t>ApplicantIncome</w:t>
+      </w:r>
+      <w:proofErr w:type="spellEnd"/>
+      <w:r>
+        <w:rPr>
+          <w:sz w:val="20"/>
+          <w:szCs w:val="20"/>
+        </w:rPr>
+        <w:t xml:space="preserve"> are the top drivers of approval, which matches known </w:t>
+      </w:r>
+      <w:proofErr w:type="spellStart"/>
+      <w:r>
+        <w:rPr>
+          <w:sz w:val="20"/>
+          <w:szCs w:val="20"/>
+        </w:rPr>
+        <w:t>behavior</w:t>
+      </w:r>
+      <w:proofErr w:type="spellEnd"/>
+      <w:r>
+        <w:rPr>
+          <w:sz w:val="20"/>
+          <w:szCs w:val="20"/>
+        </w:rPr>
+        <w:t xml:space="preserve"> of this real dataset.</w:t>
       </w:r>
     </w:p>
     <w:p>
@@ -1437,14 +1679,61 @@
           <w:sz w:val="20"/>
           <w:szCs w:val="20"/>
         </w:rPr>
-        <w:t>.github/workflows/fairness-gate.yml</w:t>
-      </w:r>
-      <w:r>
-        <w:rPr>
-          <w:sz w:val="20"/>
-          <w:szCs w:val="20"/>
-        </w:rPr>
-        <w:t xml:space="preserve"> — now runs pytest tests/ </w:t>
+        <w:t>.</w:t>
+      </w:r>
+      <w:proofErr w:type="spellStart"/>
+      <w:r>
+        <w:rPr>
+          <w:b/>
+          <w:bCs/>
+          <w:sz w:val="20"/>
+          <w:szCs w:val="20"/>
+        </w:rPr>
+        <w:t>github</w:t>
+      </w:r>
+      <w:proofErr w:type="spellEnd"/>
+      <w:r>
+        <w:rPr>
+          <w:b/>
+          <w:bCs/>
+          <w:sz w:val="20"/>
+          <w:szCs w:val="20"/>
+        </w:rPr>
+        <w:t>/workflows/fairness-</w:t>
+      </w:r>
+      <w:proofErr w:type="spellStart"/>
+      <w:r>
+        <w:rPr>
+          <w:b/>
+          <w:bCs/>
+          <w:sz w:val="20"/>
+          <w:szCs w:val="20"/>
+        </w:rPr>
+        <w:t>gate.yml</w:t>
+      </w:r>
+      <w:proofErr w:type="spellEnd"/>
+      <w:r>
+        <w:rPr>
+          <w:sz w:val="20"/>
+          <w:szCs w:val="20"/>
+        </w:rPr>
+        <w:t xml:space="preserve"> — now runs </w:t>
+      </w:r>
+      <w:proofErr w:type="spellStart"/>
+      <w:r>
+        <w:rPr>
+          <w:sz w:val="20"/>
+          <w:szCs w:val="20"/>
+        </w:rPr>
+        <w:t>pytest</w:t>
+      </w:r>
+      <w:proofErr w:type="spellEnd"/>
+      <w:r>
+        <w:rPr>
+          <w:sz w:val="20"/>
+          <w:szCs w:val="20"/>
+        </w:rPr>
+        <w:t xml:space="preserve"> tests/ </w:t>
       </w:r>
       <w:r>
         <w:rPr>
@@ -1526,8 +1815,17 @@
           <w:sz w:val="20"/>
           <w:szCs w:val="20"/>
         </w:rPr>
-        <w:t>test_drift_detection.py (5 tests) — CUSUM stability, detection, noise-rejection, reset behavior</w:t>
-      </w:r>
+        <w:t xml:space="preserve">test_drift_detection.py (5 tests) — CUSUM stability, detection, noise-rejection, reset </w:t>
+      </w:r>
+      <w:proofErr w:type="spellStart"/>
+      <w:r>
+        <w:rPr>
+          <w:sz w:val="20"/>
+          <w:szCs w:val="20"/>
+        </w:rPr>
+        <w:t>behavior</w:t>
+      </w:r>
+      <w:proofErr w:type="spellEnd"/>
     </w:p>
     <w:p>
       <w:pPr>
@@ -1561,55 +1859,55 @@
           <w:sz w:val="20"/>
           <w:szCs w:val="20"/>
         </w:rPr>
-        <w:t xml:space="preserve">: my dtype check for the Y/N label column silently broke on newer </w:t>
-      </w:r>
-      <w:proofErr w:type="gramStart"/>
-      <w:r>
-        <w:rPr>
-          <w:sz w:val="20"/>
-          <w:szCs w:val="20"/>
-        </w:rPr>
-        <w:t>pandas</w:t>
-      </w:r>
-      <w:proofErr w:type="gramEnd"/>
-      <w:r>
-        <w:rPr>
-          <w:sz w:val="20"/>
-          <w:szCs w:val="20"/>
-        </w:rPr>
-        <w:t xml:space="preserve"> versions (which infer string columns as dtype str, not object). Fixed it to </w:t>
-      </w:r>
-      <w:proofErr w:type="gramStart"/>
-      <w:r>
-        <w:rPr>
-          <w:sz w:val="20"/>
-          <w:szCs w:val="20"/>
-        </w:rPr>
-        <w:t>use .replace</w:t>
-      </w:r>
-      <w:proofErr w:type="gramEnd"/>
-      <w:r>
-        <w:rPr>
-          <w:sz w:val="20"/>
-          <w:szCs w:val="20"/>
-        </w:rPr>
-        <w:t>() + pd.to_</w:t>
-      </w:r>
-      <w:proofErr w:type="gramStart"/>
-      <w:r>
-        <w:rPr>
-          <w:sz w:val="20"/>
-          <w:szCs w:val="20"/>
-        </w:rPr>
-        <w:t>numeric(</w:t>
-      </w:r>
-      <w:proofErr w:type="gramEnd"/>
-      <w:r>
-        <w:rPr>
-          <w:sz w:val="20"/>
-          <w:szCs w:val="20"/>
-        </w:rPr>
-        <w:t>) instead — this would've been a nasty silent failure on real data if the test hadn't caught it.</w:t>
+        <w:t xml:space="preserve">: my </w:t>
+      </w:r>
+      <w:proofErr w:type="spellStart"/>
+      <w:r>
+        <w:rPr>
+          <w:sz w:val="20"/>
+          <w:szCs w:val="20"/>
+        </w:rPr>
+        <w:t>dtype</w:t>
+      </w:r>
+      <w:proofErr w:type="spellEnd"/>
+      <w:r>
+        <w:rPr>
+          <w:sz w:val="20"/>
+          <w:szCs w:val="20"/>
+        </w:rPr>
+        <w:t xml:space="preserve"> check for the Y/N label column silently broke on newer pandas versions (which infer string columns as </w:t>
+      </w:r>
+      <w:proofErr w:type="spellStart"/>
+      <w:r>
+        <w:rPr>
+          <w:sz w:val="20"/>
+          <w:szCs w:val="20"/>
+        </w:rPr>
+        <w:t>dtype</w:t>
+      </w:r>
+      <w:proofErr w:type="spellEnd"/>
+      <w:r>
+        <w:rPr>
+          <w:sz w:val="20"/>
+          <w:szCs w:val="20"/>
+        </w:rPr>
+        <w:t xml:space="preserve"> str, not object). Fixed it to use .replace() + </w:t>
+      </w:r>
+      <w:proofErr w:type="spellStart"/>
+      <w:r>
+        <w:rPr>
+          <w:sz w:val="20"/>
+          <w:szCs w:val="20"/>
+        </w:rPr>
+        <w:t>pd.to_numeric</w:t>
+      </w:r>
+      <w:proofErr w:type="spellEnd"/>
+      <w:r>
+        <w:rPr>
+          <w:sz w:val="20"/>
+          <w:szCs w:val="20"/>
+        </w:rPr>
+        <w:t>() instead — this would've been a nasty silent failure on real data if the test hadn't caught it.</w:t>
       </w:r>
     </w:p>
     <w:p>
@@ -1651,7 +1949,7 @@
           <w:noProof/>
         </w:rPr>
         <w:drawing>
-          <wp:inline distT="0" distB="0" distL="0" distR="0" wp14:anchorId="27A92113" wp14:editId="36EDC874">
+          <wp:inline distT="0" distB="0" distL="0" distR="0" wp14:anchorId="27A92113" wp14:editId="39333CE8">
             <wp:extent cx="5731510" cy="4570095"/>
             <wp:effectExtent l="0" t="0" r="2540" b="1905"/>
             <wp:docPr id="1984068560" name="Picture 1"/>
@@ -1699,6 +1997,439 @@
           </wp:inline>
         </w:drawing>
       </w:r>
+    </w:p>
+    <w:p>
+      <w:pPr>
+        <w:rPr>
+          <w:b/>
+          <w:bCs/>
+          <w:sz w:val="20"/>
+          <w:szCs w:val="20"/>
+        </w:rPr>
+      </w:pPr>
+      <w:r>
+        <w:rPr>
+          <w:b/>
+          <w:bCs/>
+          <w:sz w:val="20"/>
+          <w:szCs w:val="20"/>
+        </w:rPr>
+        <w:t>Test everything locally before you touch the UI further</w:t>
+      </w:r>
+    </w:p>
+    <w:p>
+      <w:pPr>
+        <w:rPr>
+          <w:sz w:val="20"/>
+          <w:szCs w:val="20"/>
+        </w:rPr>
+      </w:pPr>
+      <w:r>
+        <w:rPr>
+          <w:sz w:val="20"/>
+          <w:szCs w:val="20"/>
+        </w:rPr>
+        <w:t>bash</w:t>
+      </w:r>
+    </w:p>
+    <w:p>
+      <w:pPr>
+        <w:rPr>
+          <w:sz w:val="20"/>
+          <w:szCs w:val="20"/>
+        </w:rPr>
+      </w:pPr>
+      <w:r>
+        <w:rPr>
+          <w:sz w:val="20"/>
+          <w:szCs w:val="20"/>
+        </w:rPr>
+        <w:t>pip install -r requirements.txt</w:t>
+      </w:r>
+    </w:p>
+    <w:p>
+      <w:pPr>
+        <w:rPr>
+          <w:sz w:val="20"/>
+          <w:szCs w:val="20"/>
+        </w:rPr>
+      </w:pPr>
+      <w:r>
+        <w:rPr>
+          <w:sz w:val="20"/>
+          <w:szCs w:val="20"/>
+        </w:rPr>
+        <w:lastRenderedPageBreak/>
+        <w:t xml:space="preserve">python -m </w:t>
+      </w:r>
+      <w:proofErr w:type="spellStart"/>
+      <w:r>
+        <w:rPr>
+          <w:sz w:val="20"/>
+          <w:szCs w:val="20"/>
+        </w:rPr>
+        <w:t>pytest</w:t>
+      </w:r>
+      <w:proofErr w:type="spellEnd"/>
+      <w:r>
+        <w:rPr>
+          <w:sz w:val="20"/>
+          <w:szCs w:val="20"/>
+        </w:rPr>
+        <w:t xml:space="preserve"> tests -v</w:t>
+      </w:r>
+      <w:r>
+        <w:rPr>
+          <w:sz w:val="20"/>
+          <w:szCs w:val="20"/>
+        </w:rPr>
+        <w:t xml:space="preserve">                </w:t>
+      </w:r>
+      <w:r>
+        <w:rPr>
+          <w:sz w:val="20"/>
+          <w:szCs w:val="20"/>
+        </w:rPr>
+        <w:t># should show 19 passed</w:t>
+      </w:r>
+    </w:p>
+    <w:p>
+      <w:pPr>
+        <w:rPr>
+          <w:sz w:val="20"/>
+          <w:szCs w:val="20"/>
+        </w:rPr>
+      </w:pPr>
+      <w:r>
+        <w:rPr>
+          <w:sz w:val="20"/>
+          <w:szCs w:val="20"/>
+        </w:rPr>
+        <w:t>python scripts/fairness_gate.py --threshold 0.8</w:t>
+      </w:r>
+    </w:p>
+    <w:p>
+      <w:pPr>
+        <w:rPr>
+          <w:sz w:val="20"/>
+          <w:szCs w:val="20"/>
+        </w:rPr>
+      </w:pPr>
+      <w:r>
+        <w:rPr>
+          <w:sz w:val="20"/>
+          <w:szCs w:val="20"/>
+        </w:rPr>
+        <w:t>python scripts/cusum_drift_detection.py</w:t>
+      </w:r>
+    </w:p>
+    <w:p>
+      <w:pPr>
+        <w:rPr>
+          <w:sz w:val="20"/>
+          <w:szCs w:val="20"/>
+        </w:rPr>
+      </w:pPr>
+      <w:r>
+        <w:rPr>
+          <w:sz w:val="20"/>
+          <w:szCs w:val="20"/>
+        </w:rPr>
+        <w:t xml:space="preserve">python src/train_model.py     </w:t>
+      </w:r>
+    </w:p>
+    <w:p>
+      <w:pPr>
+        <w:rPr>
+          <w:sz w:val="20"/>
+          <w:szCs w:val="20"/>
+        </w:rPr>
+      </w:pPr>
+      <w:r>
+        <w:rPr>
+          <w:sz w:val="20"/>
+          <w:szCs w:val="20"/>
+        </w:rPr>
+        <w:t xml:space="preserve">python -m </w:t>
+      </w:r>
+      <w:proofErr w:type="spellStart"/>
+      <w:r>
+        <w:rPr>
+          <w:sz w:val="20"/>
+          <w:szCs w:val="20"/>
+        </w:rPr>
+        <w:t>streamlit</w:t>
+      </w:r>
+      <w:proofErr w:type="spellEnd"/>
+      <w:r>
+        <w:rPr>
+          <w:sz w:val="20"/>
+          <w:szCs w:val="20"/>
+        </w:rPr>
+        <w:t xml:space="preserve"> run app.py</w:t>
+      </w:r>
+    </w:p>
+    <w:p>
+      <w:pPr>
+        <w:rPr>
+          <w:sz w:val="20"/>
+          <w:szCs w:val="20"/>
+        </w:rPr>
+      </w:pPr>
+      <w:r>
+        <w:rPr>
+          <w:sz w:val="20"/>
+          <w:szCs w:val="20"/>
+        </w:rPr>
+        <w:t xml:space="preserve">For deleting cache - </w:t>
+      </w:r>
+      <w:r>
+        <w:rPr>
+          <w:sz w:val="20"/>
+          <w:szCs w:val="20"/>
+        </w:rPr>
+        <w:t>del data\processed\loan_data_clean.csv</w:t>
+      </w:r>
+    </w:p>
+    <w:p>
+      <w:pPr>
+        <w:rPr>
+          <w:sz w:val="20"/>
+          <w:szCs w:val="20"/>
+        </w:rPr>
+      </w:pPr>
+    </w:p>
+    <w:p>
+      <w:pPr>
+        <w:rPr>
+          <w:sz w:val="20"/>
+          <w:szCs w:val="20"/>
+        </w:rPr>
+      </w:pPr>
+    </w:p>
+    <w:p>
+      <w:pPr>
+        <w:rPr>
+          <w:sz w:val="20"/>
+          <w:szCs w:val="20"/>
+        </w:rPr>
+      </w:pPr>
+      <w:r>
+        <w:rPr>
+          <w:b/>
+          <w:bCs/>
+          <w:sz w:val="20"/>
+          <w:szCs w:val="20"/>
+        </w:rPr>
+        <w:t xml:space="preserve">To push the code into </w:t>
+      </w:r>
+      <w:proofErr w:type="spellStart"/>
+      <w:r>
+        <w:rPr>
+          <w:b/>
+          <w:bCs/>
+          <w:sz w:val="20"/>
+          <w:szCs w:val="20"/>
+        </w:rPr>
+        <w:t>github</w:t>
+      </w:r>
+      <w:proofErr w:type="spellEnd"/>
+      <w:r>
+        <w:rPr>
+          <w:b/>
+          <w:bCs/>
+          <w:sz w:val="20"/>
+          <w:szCs w:val="20"/>
+        </w:rPr>
+        <w:t xml:space="preserve"> for the first time </w:t>
+      </w:r>
+    </w:p>
+    <w:p>
+      <w:pPr>
+        <w:rPr>
+          <w:sz w:val="20"/>
+          <w:szCs w:val="20"/>
+        </w:rPr>
+      </w:pPr>
+      <w:r>
+        <w:rPr>
+          <w:sz w:val="20"/>
+          <w:szCs w:val="20"/>
+        </w:rPr>
+        <w:t xml:space="preserve">git </w:t>
+      </w:r>
+      <w:proofErr w:type="spellStart"/>
+      <w:r>
+        <w:rPr>
+          <w:sz w:val="20"/>
+          <w:szCs w:val="20"/>
+        </w:rPr>
+        <w:t>init</w:t>
+      </w:r>
+      <w:proofErr w:type="spellEnd"/>
+    </w:p>
+    <w:p>
+      <w:pPr>
+        <w:rPr>
+          <w:sz w:val="20"/>
+          <w:szCs w:val="20"/>
+        </w:rPr>
+      </w:pPr>
+      <w:r>
+        <w:rPr>
+          <w:sz w:val="20"/>
+          <w:szCs w:val="20"/>
+        </w:rPr>
+        <w:t>git add .</w:t>
+      </w:r>
+    </w:p>
+    <w:p>
+      <w:pPr>
+        <w:rPr>
+          <w:sz w:val="20"/>
+          <w:szCs w:val="20"/>
+        </w:rPr>
+      </w:pPr>
+      <w:r>
+        <w:rPr>
+          <w:sz w:val="20"/>
+          <w:szCs w:val="20"/>
+        </w:rPr>
+        <w:t>git commit -m "Initial commit"</w:t>
+      </w:r>
+    </w:p>
+    <w:p>
+      <w:pPr>
+        <w:rPr>
+          <w:sz w:val="20"/>
+          <w:szCs w:val="20"/>
+        </w:rPr>
+      </w:pPr>
+      <w:r>
+        <w:rPr>
+          <w:sz w:val="20"/>
+          <w:szCs w:val="20"/>
+        </w:rPr>
+        <w:t>git branch -M main</w:t>
+      </w:r>
+    </w:p>
+    <w:p>
+      <w:pPr>
+        <w:rPr>
+          <w:sz w:val="20"/>
+          <w:szCs w:val="20"/>
+        </w:rPr>
+      </w:pPr>
+      <w:r>
+        <w:rPr>
+          <w:sz w:val="20"/>
+          <w:szCs w:val="20"/>
+        </w:rPr>
+        <w:t>git remote add origin https://github.com/username/repo-name.git</w:t>
+      </w:r>
+    </w:p>
+    <w:p>
+      <w:pPr>
+        <w:rPr>
+          <w:sz w:val="20"/>
+          <w:szCs w:val="20"/>
+        </w:rPr>
+      </w:pPr>
+      <w:r>
+        <w:rPr>
+          <w:sz w:val="20"/>
+          <w:szCs w:val="20"/>
+        </w:rPr>
+        <w:t>git push -u origin main</w:t>
+      </w:r>
+    </w:p>
+    <w:p>
+      <w:pPr>
+        <w:rPr>
+          <w:sz w:val="20"/>
+          <w:szCs w:val="20"/>
+        </w:rPr>
+      </w:pPr>
+    </w:p>
+    <w:p>
+      <w:pPr>
+        <w:rPr>
+          <w:b/>
+          <w:bCs/>
+          <w:sz w:val="20"/>
+          <w:szCs w:val="20"/>
+        </w:rPr>
+      </w:pPr>
+      <w:r>
+        <w:rPr>
+          <w:b/>
+          <w:bCs/>
+          <w:sz w:val="20"/>
+          <w:szCs w:val="20"/>
+        </w:rPr>
+        <w:t>After making changes:</w:t>
+      </w:r>
+    </w:p>
+    <w:p>
+      <w:pPr>
+        <w:rPr>
+          <w:sz w:val="20"/>
+          <w:szCs w:val="20"/>
+        </w:rPr>
+      </w:pPr>
+      <w:r>
+        <w:rPr>
+          <w:sz w:val="20"/>
+          <w:szCs w:val="20"/>
+        </w:rPr>
+        <w:t>git add .</w:t>
+      </w:r>
+    </w:p>
+    <w:p>
+      <w:pPr>
+        <w:rPr>
+          <w:sz w:val="20"/>
+          <w:szCs w:val="20"/>
+        </w:rPr>
+      </w:pPr>
+      <w:r>
+        <w:rPr>
+          <w:sz w:val="20"/>
+          <w:szCs w:val="20"/>
+        </w:rPr>
+        <w:t>git commit -m "Updated project"</w:t>
+      </w:r>
+    </w:p>
+    <w:p>
+      <w:pPr>
+        <w:rPr>
+          <w:sz w:val="20"/>
+          <w:szCs w:val="20"/>
+        </w:rPr>
+      </w:pPr>
+      <w:r>
+        <w:rPr>
+          <w:sz w:val="20"/>
+          <w:szCs w:val="20"/>
+        </w:rPr>
+        <w:t>git push</w:t>
+      </w:r>
+    </w:p>
+    <w:p>
+      <w:pPr>
+        <w:rPr>
+          <w:sz w:val="20"/>
+          <w:szCs w:val="20"/>
+        </w:rPr>
+      </w:pPr>
+    </w:p>
+    <w:p>
+      <w:pPr>
+        <w:rPr>
+          <w:sz w:val="20"/>
+          <w:szCs w:val="20"/>
+        </w:rPr>
+      </w:pPr>
     </w:p>
     <w:sectPr>
       <w:pgSz w:w="11906" w:h="16838"/>

</xml_diff>